<commit_message>
Document changes and DT use
</commit_message>
<xml_diff>
--- a/DOC/Networks 2 - TP01 Report.docx
+++ b/DOC/Networks 2 - TP01 Report.docx
@@ -27,6 +27,9 @@
       </w:r>
     </w:p>
     <w:p>
+      <w:pPr>
+        <w:jc w:val="both"/>
+      </w:pPr>
       <w:r>
         <w:t>The project is a 2-player game of</w:t>
       </w:r>
@@ -34,30 +37,46 @@
         <w:t xml:space="preserve"> Infinite P</w:t>
       </w:r>
       <w:r>
-        <w:t>ong. It follows the classical rules of this game.</w:t>
-      </w:r>
-    </w:p>
-    <w:p>
-      <w:r>
-        <w:t xml:space="preserve">The players control each a paddle, and they need to intercept a ball, so it does not enter </w:t>
-      </w:r>
-      <w:r>
-        <w:t>the players</w:t>
-      </w:r>
-      <w:r>
-        <w:t xml:space="preserve"> side, if the other player does not intercept the ball before </w:t>
-      </w:r>
-      <w:r>
-        <w:t xml:space="preserve">and </w:t>
-      </w:r>
-      <w:r>
-        <w:t xml:space="preserve">it touches his side you receive a point </w:t>
-      </w:r>
-      <w:r>
-        <w:t>and</w:t>
-      </w:r>
-      <w:r>
-        <w:t xml:space="preserve"> vice versa.</w:t>
+        <w:t xml:space="preserve">ong. It follows the classical rules of </w:t>
+      </w:r>
+      <w:r>
+        <w:t>Pong but runs until a player leaves</w:t>
+      </w:r>
+      <w:r>
+        <w:t>.</w:t>
+      </w:r>
+    </w:p>
+    <w:p>
+      <w:r>
+        <w:t xml:space="preserve">The players control </w:t>
+      </w:r>
+      <w:r>
+        <w:t xml:space="preserve">one </w:t>
+      </w:r>
+      <w:r>
+        <w:t>paddle</w:t>
+      </w:r>
+      <w:r>
+        <w:t xml:space="preserve"> each. They</w:t>
+      </w:r>
+      <w:r>
+        <w:t xml:space="preserve"> </w:t>
+      </w:r>
+      <w:r>
+        <w:t xml:space="preserve">must stop the ball from entering in their </w:t>
+      </w:r>
+      <w:proofErr w:type="gramStart"/>
+      <w:r>
+        <w:t>goal, but</w:t>
+      </w:r>
+      <w:proofErr w:type="gramEnd"/>
+      <w:r>
+        <w:t xml:space="preserve"> must make the ball enter the other player’s goal.</w:t>
+      </w:r>
+    </w:p>
+    <w:p>
+      <w:r>
+        <w:t>Hitting a goal with the ball gives a point to the player opposite of the goal.</w:t>
       </w:r>
     </w:p>
     <w:p>
@@ -69,93 +88,617 @@
       </w:r>
     </w:p>
     <w:p>
-      <w:r>
-        <w:t>The client and the server send each other packages, the client takes care of showing the game on a window and the server takes care of creating the logic of the game. First the client sends a message to the server saying he is read</w:t>
-      </w:r>
-      <w:r>
-        <w:t>y,</w:t>
-      </w:r>
-      <w:r>
-        <w:t xml:space="preserve"> the server waits until 2 players are in the game</w:t>
-      </w:r>
-      <w:r>
-        <w:t>,</w:t>
-      </w:r>
-      <w:r>
-        <w:t xml:space="preserve"> when both players send the message saying they are ready the server starts sending message of the </w:t>
-      </w:r>
-      <w:r>
-        <w:t>ball</w:t>
+      <w:pPr>
+        <w:pStyle w:val="Heading2"/>
+      </w:pPr>
+      <w:r>
+        <w:t>Game</w:t>
+      </w:r>
+    </w:p>
+    <w:p>
+      <w:r>
+        <w:t>We mostly used OOP to create the game. We created a simple physics, collider, and shape system to simulate a pong match.</w:t>
+      </w:r>
+    </w:p>
+    <w:p>
+      <w:r>
+        <w:t>The physics system just checks if a physics object has collided with any collider that is present in the game.</w:t>
+      </w:r>
+    </w:p>
+    <w:p>
+      <w:r>
+        <w:t xml:space="preserve">Each collider is responsible for handling a collision with a physics object. For example, a paddle </w:t>
+      </w:r>
+      <w:r>
+        <w:t xml:space="preserve">must handle being hit by the </w:t>
+      </w:r>
+      <w:proofErr w:type="gramStart"/>
+      <w:r>
+        <w:t>ball, and</w:t>
+      </w:r>
+      <w:proofErr w:type="gramEnd"/>
+      <w:r>
+        <w:t xml:space="preserve"> does so by sending it back where it came from (depending on the angle in which the ball hit).</w:t>
+      </w:r>
+    </w:p>
+    <w:p>
+      <w:r>
+        <w:t>A goal manage</w:t>
+      </w:r>
+      <w:r>
+        <w:t>r</w:t>
+      </w:r>
+      <w:r>
+        <w:t xml:space="preserve"> is responsible for handling goals and to keep track of scores.</w:t>
+      </w:r>
+    </w:p>
+    <w:p>
+      <w:r>
+        <w:t>The shape controller allows a user to take control of a shape. We use this to allow the player to control their paddle.</w:t>
+      </w:r>
+    </w:p>
+    <w:p>
+      <w:r>
+        <w:t>The game is displayed using pygame, and is only done in the client, the server only handles logic.</w:t>
+      </w:r>
+    </w:p>
+    <w:p>
+      <w:pPr>
+        <w:pStyle w:val="Heading2"/>
+      </w:pPr>
+      <w:r>
+        <w:t>Networking</w:t>
+      </w:r>
+    </w:p>
+    <w:p>
+      <w:r>
+        <w:t xml:space="preserve">We used UDP and a Server-Client Structure for the networking part of the game. </w:t>
+      </w:r>
+      <w:r>
+        <w:t>Both client and server will attempt to send 60 packets per second.</w:t>
+      </w:r>
+    </w:p>
+    <w:p>
+      <w:r>
+        <w:t xml:space="preserve">We’ll </w:t>
+      </w:r>
+      <w:r>
+        <w:t>first</w:t>
       </w:r>
       <w:r>
         <w:t xml:space="preserve"> </w:t>
       </w:r>
       <w:r>
-        <w:t>direction and position, both players position the score and packet number the client visualizes the changes on the window and sends message to the server with player id</w:t>
-      </w:r>
-      <w:r>
-        <w:t>,</w:t>
-      </w:r>
-      <w:r>
-        <w:t xml:space="preserve"> player position and the packet number, because the server and the client are receiving a lot of packages and not all come in order we only take care of the youngest packet and the other are discarded, for the server we need to make sure that we take the youngest package for both players. The messages are </w:t>
-      </w:r>
-      <w:r>
-        <w:t>sent</w:t>
-      </w:r>
-      <w:r>
-        <w:t xml:space="preserve"> encoded and are decoded when arriving, they are divided in the information needed and the</w:t>
-      </w:r>
-      <w:r>
-        <w:t>n</w:t>
-      </w:r>
-      <w:r>
-        <w:t xml:space="preserve"> used</w:t>
-      </w:r>
-      <w:r>
-        <w:t xml:space="preserve"> on server or client</w:t>
-      </w:r>
+        <w:t>explain the</w:t>
+      </w:r>
+      <w:r>
+        <w:t xml:space="preserve"> networking part</w:t>
+      </w:r>
+      <w:r>
+        <w:t xml:space="preserve"> of the client</w:t>
+      </w:r>
+      <w:r>
+        <w:t>:</w:t>
+      </w:r>
+    </w:p>
+    <w:p>
+      <w:pPr>
+        <w:pStyle w:val="ListParagraph"/>
+        <w:numPr>
+          <w:ilvl w:val="0"/>
+          <w:numId w:val="1"/>
+        </w:numPr>
+      </w:pPr>
+      <w:r>
+        <w:t xml:space="preserve">To connect to a server, a client sends a special packet to said server. The client then waits 1 second to receive an approval by the server. It will do this 10 times, and if </w:t>
+      </w:r>
+      <w:r>
+        <w:t>the client has not received approval by the server</w:t>
+      </w:r>
+      <w:r>
+        <w:t xml:space="preserve"> by the tenth time it does this, it will give up and assume that it cannot reach the server.</w:t>
+      </w:r>
+      <w:r>
+        <w:br/>
+        <w:t>If the client attempts to join a server that is full, the server will send back a</w:t>
+      </w:r>
+      <w:r>
+        <w:t xml:space="preserve"> refusal</w:t>
+      </w:r>
+      <w:r>
+        <w:t xml:space="preserve"> </w:t>
+      </w:r>
+      <w:r>
+        <w:t>packet</w:t>
+      </w:r>
+      <w:r>
+        <w:t xml:space="preserve"> stating so, and the client will not be able to join the server.</w:t>
+      </w:r>
+    </w:p>
+    <w:p>
+      <w:pPr>
+        <w:pStyle w:val="ListParagraph"/>
+        <w:numPr>
+          <w:ilvl w:val="0"/>
+          <w:numId w:val="1"/>
+        </w:numPr>
+      </w:pPr>
+      <w:r>
+        <w:t>If the client successfully connects to the server, they will receive an ID back from the server, which will be the player the client will be controlling (1 for the left player, 2 for the right one).</w:t>
+      </w:r>
+    </w:p>
+    <w:p>
+      <w:pPr>
+        <w:pStyle w:val="ListParagraph"/>
+        <w:numPr>
+          <w:ilvl w:val="0"/>
+          <w:numId w:val="1"/>
+        </w:numPr>
+      </w:pPr>
+      <w:r>
+        <w:t>The client will then wait for a packet from the server, which indicates that the game has started.</w:t>
+      </w:r>
+    </w:p>
+    <w:p>
+      <w:pPr>
+        <w:pStyle w:val="ListParagraph"/>
+        <w:numPr>
+          <w:ilvl w:val="0"/>
+          <w:numId w:val="1"/>
+        </w:numPr>
+      </w:pPr>
+      <w:r>
+        <w:t xml:space="preserve">On each frame, the client will search the packet buffer for the most recent packet received by the server. There are 2 possible packet types </w:t>
+      </w:r>
+      <w:r>
+        <w:t xml:space="preserve">that </w:t>
+      </w:r>
+      <w:r>
+        <w:t>the client can receive at this stage:</w:t>
+      </w:r>
+    </w:p>
+    <w:p>
+      <w:pPr>
+        <w:pStyle w:val="ListParagraph"/>
+        <w:numPr>
+          <w:ilvl w:val="1"/>
+          <w:numId w:val="1"/>
+        </w:numPr>
+      </w:pPr>
+      <w:r>
+        <w:t>A quit packet. This packet means that the other player has left, so the client will end the game view and print the final score on the console.</w:t>
+      </w:r>
+      <w:r>
+        <w:br/>
+      </w:r>
+      <w:r>
+        <w:rPr>
+          <w:b/>
+          <w:bCs/>
+          <w:i/>
+          <w:iCs/>
+        </w:rPr>
+        <w:lastRenderedPageBreak/>
+        <w:t>Note: This</w:t>
+      </w:r>
+      <w:r>
+        <w:rPr>
+          <w:b/>
+          <w:bCs/>
+          <w:i/>
+          <w:iCs/>
+        </w:rPr>
+        <w:t xml:space="preserve"> packet takes priority over all other packets. That is, if this packet is received, and is not the most recent packet, the game will </w:t>
+      </w:r>
+      <w:r>
+        <w:rPr>
+          <w:b/>
+          <w:bCs/>
+          <w:i/>
+          <w:iCs/>
+        </w:rPr>
+        <w:t>end</w:t>
+      </w:r>
+      <w:r>
+        <w:rPr>
+          <w:b/>
+          <w:bCs/>
+          <w:i/>
+          <w:iCs/>
+        </w:rPr>
+        <w:t xml:space="preserve"> anyway</w:t>
+      </w:r>
+      <w:r>
+        <w:rPr>
+          <w:b/>
+          <w:bCs/>
+          <w:i/>
+          <w:iCs/>
+        </w:rPr>
+        <w:t>!</w:t>
+      </w:r>
+    </w:p>
+    <w:p>
+      <w:pPr>
+        <w:pStyle w:val="ListParagraph"/>
+        <w:numPr>
+          <w:ilvl w:val="1"/>
+          <w:numId w:val="1"/>
+        </w:numPr>
+      </w:pPr>
+      <w:r>
+        <w:t>A normal, game state packet. This packet contains information about the game state that the client will process so that it is synchronized with the server.</w:t>
+      </w:r>
+      <w:r>
+        <w:br/>
+        <w:t>This game state packet contains information about where the ball is, the ball direction, both player positions, the score, and the packet number:</w:t>
+      </w:r>
+    </w:p>
+    <w:p>
+      <w:pPr>
+        <w:pStyle w:val="ListParagraph"/>
+        <w:numPr>
+          <w:ilvl w:val="2"/>
+          <w:numId w:val="1"/>
+        </w:numPr>
+      </w:pPr>
+      <w:r>
+        <w:t xml:space="preserve">The client will not always set the ball position to the same position as the </w:t>
+      </w:r>
+      <w:proofErr w:type="gramStart"/>
+      <w:r>
+        <w:t>server’s,</w:t>
+      </w:r>
+      <w:proofErr w:type="gramEnd"/>
+      <w:r>
+        <w:t xml:space="preserve"> some wiggle room is allowed as to give a smooth experience to the clients.</w:t>
+      </w:r>
+    </w:p>
+    <w:p>
+      <w:pPr>
+        <w:pStyle w:val="ListParagraph"/>
+        <w:numPr>
+          <w:ilvl w:val="2"/>
+          <w:numId w:val="1"/>
+        </w:numPr>
+      </w:pPr>
+      <w:r>
+        <w:t xml:space="preserve">Since ball direction is a lot more crucial, </w:t>
+      </w:r>
+      <w:r>
+        <w:t>we did not allow any wiggle room, but we did allow the client a small chance (in milliseconds) to synchronize with the server. If this is not done, the client will set both it’s ball position and direction to the same ones as the server.</w:t>
+      </w:r>
+    </w:p>
+    <w:p>
+      <w:pPr>
+        <w:pStyle w:val="ListParagraph"/>
+        <w:numPr>
+          <w:ilvl w:val="2"/>
+          <w:numId w:val="1"/>
+        </w:numPr>
+      </w:pPr>
+      <w:r>
+        <w:t>The client is only authoritative on one thing, and that is its own player position. The client will never set its own player position to the one given by the server, but it will always set its opponents position to the one received by the server.</w:t>
+      </w:r>
+    </w:p>
+    <w:p>
+      <w:pPr>
+        <w:pStyle w:val="ListParagraph"/>
+        <w:numPr>
+          <w:ilvl w:val="2"/>
+          <w:numId w:val="1"/>
+        </w:numPr>
+      </w:pPr>
+      <w:r>
+        <w:t>The client knows a goal has been scored</w:t>
+      </w:r>
+      <w:r>
+        <w:t xml:space="preserve"> when the score received by the server is different than the </w:t>
+      </w:r>
+      <w:proofErr w:type="gramStart"/>
+      <w:r>
+        <w:t>client’s</w:t>
+      </w:r>
+      <w:proofErr w:type="gramEnd"/>
       <w:r>
         <w:t>.</w:t>
       </w:r>
     </w:p>
     <w:p>
-      <w:r>
-        <w:t xml:space="preserve">Updating the ball on the window is only done when there is a big difference between the ball position and the given position by the server, when the client receives that the score has </w:t>
-      </w:r>
-      <w:r>
-        <w:t>changed,</w:t>
-      </w:r>
-      <w:r>
-        <w:t xml:space="preserve"> he updates the score and recentres the game, the ball is then ejected to one random side.</w:t>
-      </w:r>
-      <w:r>
-        <w:t xml:space="preserve"> The ball </w:t>
-      </w:r>
-      <w:r>
-        <w:t>changes direction and automatically also the position if there is a difference in the server and the client for several ticks where the ball has not the same direction.</w:t>
-      </w:r>
-    </w:p>
-    <w:p>
-      <w:r>
-        <w:t xml:space="preserve">This game was done using </w:t>
-      </w:r>
-      <w:proofErr w:type="spellStart"/>
-      <w:r>
-        <w:t>pygame</w:t>
-      </w:r>
-      <w:proofErr w:type="spellEnd"/>
+      <w:pPr>
+        <w:pStyle w:val="ListParagraph"/>
+        <w:numPr>
+          <w:ilvl w:val="0"/>
+          <w:numId w:val="1"/>
+        </w:numPr>
+      </w:pPr>
+      <w:r>
+        <w:t xml:space="preserve">If the client has stopped receiving </w:t>
+      </w:r>
+      <w:r>
+        <w:t xml:space="preserve">packets </w:t>
+      </w:r>
+      <w:r>
+        <w:t>from the server from more than 10 seconds, it will assume that it can no longer reach the server, so it will end the game view and print the final score on the console.</w:t>
+      </w:r>
+    </w:p>
+    <w:p>
+      <w:pPr>
+        <w:pStyle w:val="ListParagraph"/>
+        <w:numPr>
+          <w:ilvl w:val="0"/>
+          <w:numId w:val="1"/>
+        </w:numPr>
+      </w:pPr>
+      <w:r>
+        <w:t xml:space="preserve">At the end of each frame, the client will send a package to the server containing </w:t>
+      </w:r>
+      <w:proofErr w:type="gramStart"/>
+      <w:r>
+        <w:t>it’s</w:t>
+      </w:r>
+      <w:proofErr w:type="gramEnd"/>
+      <w:r>
+        <w:t xml:space="preserve"> ID, position, and packet number. The server will use this packet to synchronize player positions.</w:t>
+      </w:r>
+    </w:p>
+    <w:p>
+      <w:r>
+        <w:t>Now, for the server:</w:t>
+      </w:r>
+    </w:p>
+    <w:p>
+      <w:pPr>
+        <w:pStyle w:val="ListParagraph"/>
+        <w:numPr>
+          <w:ilvl w:val="0"/>
+          <w:numId w:val="1"/>
+        </w:numPr>
+      </w:pPr>
+      <w:r>
+        <w:t>The server will start by waiting for a join request from 2 clients. Depending on the order of them joining, they will receive either the “1” player ID or “2”.</w:t>
+      </w:r>
+    </w:p>
+    <w:p>
+      <w:pPr>
+        <w:pStyle w:val="ListParagraph"/>
+        <w:numPr>
+          <w:ilvl w:val="0"/>
+          <w:numId w:val="1"/>
+        </w:numPr>
+      </w:pPr>
+      <w:r>
+        <w:t>Once 2 clients have connected, the game will start to be simulated.</w:t>
+      </w:r>
+    </w:p>
+    <w:p>
+      <w:pPr>
+        <w:pStyle w:val="ListParagraph"/>
+        <w:numPr>
+          <w:ilvl w:val="0"/>
+          <w:numId w:val="1"/>
+        </w:numPr>
+      </w:pPr>
+      <w:r>
+        <w:t xml:space="preserve">On each frame, the </w:t>
+      </w:r>
+      <w:r>
+        <w:t>server</w:t>
+      </w:r>
+      <w:r>
+        <w:t xml:space="preserve"> will search the packet buffer for the</w:t>
+      </w:r>
+      <w:r>
+        <w:t xml:space="preserve"> 2</w:t>
+      </w:r>
+      <w:r>
+        <w:t xml:space="preserve"> most recent packet</w:t>
+      </w:r>
+      <w:r>
+        <w:t>s</w:t>
+      </w:r>
+      <w:r>
+        <w:t xml:space="preserve"> received by </w:t>
+      </w:r>
+      <w:r>
+        <w:t>each</w:t>
+      </w:r>
+      <w:r>
+        <w:t xml:space="preserve"> </w:t>
+      </w:r>
+      <w:r>
+        <w:t>client</w:t>
+      </w:r>
+      <w:r>
+        <w:t xml:space="preserve">. There are </w:t>
+      </w:r>
+      <w:r>
+        <w:t>3</w:t>
+      </w:r>
+      <w:r>
+        <w:t xml:space="preserve"> possible packet types that the </w:t>
+      </w:r>
+      <w:r>
+        <w:t>server</w:t>
+      </w:r>
+      <w:r>
+        <w:t xml:space="preserve"> can receive at this stage:</w:t>
+      </w:r>
+    </w:p>
+    <w:p>
+      <w:pPr>
+        <w:pStyle w:val="ListParagraph"/>
+        <w:numPr>
+          <w:ilvl w:val="1"/>
+          <w:numId w:val="1"/>
+        </w:numPr>
+      </w:pPr>
+      <w:r>
+        <w:t xml:space="preserve">A quit packet. </w:t>
+      </w:r>
+      <w:r>
+        <w:t>This means that one of the players has left, so the server will end the game</w:t>
+      </w:r>
       <w:r>
         <w:t>.</w:t>
       </w:r>
-    </w:p>
-    <w:p>
-      <w:pPr>
-        <w:tabs>
-          <w:tab w:val="left" w:pos="1296"/>
-        </w:tabs>
-      </w:pPr>
-      <w:r>
-        <w:tab/>
+      <w:r>
+        <w:br/>
+      </w:r>
+      <w:r>
+        <w:rPr>
+          <w:b/>
+          <w:bCs/>
+          <w:i/>
+          <w:iCs/>
+        </w:rPr>
+        <w:t>Note: This</w:t>
+      </w:r>
+      <w:r>
+        <w:rPr>
+          <w:b/>
+          <w:bCs/>
+          <w:i/>
+          <w:iCs/>
+        </w:rPr>
+        <w:t xml:space="preserve"> packet takes priority over all other packets. That is, if this packet is received, and is not the most recent packet, the game will </w:t>
+      </w:r>
+      <w:r>
+        <w:rPr>
+          <w:b/>
+          <w:bCs/>
+          <w:i/>
+          <w:iCs/>
+        </w:rPr>
+        <w:t>end</w:t>
+      </w:r>
+      <w:r>
+        <w:rPr>
+          <w:b/>
+          <w:bCs/>
+          <w:i/>
+          <w:iCs/>
+        </w:rPr>
+        <w:t xml:space="preserve"> anyway</w:t>
+      </w:r>
+      <w:r>
+        <w:rPr>
+          <w:b/>
+          <w:bCs/>
+          <w:i/>
+          <w:iCs/>
+        </w:rPr>
+        <w:t>!</w:t>
+      </w:r>
+    </w:p>
+    <w:p>
+      <w:pPr>
+        <w:pStyle w:val="ListParagraph"/>
+        <w:numPr>
+          <w:ilvl w:val="1"/>
+          <w:numId w:val="1"/>
+        </w:numPr>
+      </w:pPr>
+      <w:r>
+        <w:t>A player position packet. This packet will be used to know where both players are at all times.</w:t>
+      </w:r>
+    </w:p>
+    <w:p>
+      <w:pPr>
+        <w:pStyle w:val="ListParagraph"/>
+        <w:numPr>
+          <w:ilvl w:val="1"/>
+          <w:numId w:val="1"/>
+        </w:numPr>
+      </w:pPr>
+      <w:r>
+        <w:t xml:space="preserve">A join packet. This means that a third </w:t>
+      </w:r>
+      <w:r>
+        <w:t>client</w:t>
+      </w:r>
+      <w:r>
+        <w:t xml:space="preserve"> is trying to join the </w:t>
+      </w:r>
+      <w:r>
+        <w:t>server</w:t>
+      </w:r>
+      <w:r>
+        <w:t xml:space="preserve">, which is not possible. The </w:t>
+      </w:r>
+      <w:r>
+        <w:t>server</w:t>
+      </w:r>
+      <w:r>
+        <w:t xml:space="preserve"> will respond by sending a refusal packet.</w:t>
+      </w:r>
+    </w:p>
+    <w:p>
+      <w:pPr>
+        <w:pStyle w:val="ListParagraph"/>
+        <w:numPr>
+          <w:ilvl w:val="0"/>
+          <w:numId w:val="1"/>
+        </w:numPr>
+      </w:pPr>
+      <w:r>
+        <w:t xml:space="preserve">If the </w:t>
+      </w:r>
+      <w:r>
+        <w:t>server</w:t>
+      </w:r>
+      <w:r>
+        <w:t xml:space="preserve"> has stopped receiving </w:t>
+      </w:r>
+      <w:r>
+        <w:t>packets from any client for more than 3 seconds, it will pause the game and wait</w:t>
+      </w:r>
+      <w:r>
+        <w:t xml:space="preserve"> until it has received a packet from the missing client/s.</w:t>
+      </w:r>
+    </w:p>
+    <w:p>
+      <w:pPr>
+        <w:pStyle w:val="ListParagraph"/>
+        <w:numPr>
+          <w:ilvl w:val="0"/>
+          <w:numId w:val="1"/>
+        </w:numPr>
+      </w:pPr>
+      <w:r>
+        <w:t xml:space="preserve">If the server has stopped receiving packets from any client for more than 10 seconds, it will assume that the client/s can no longer reach the </w:t>
+      </w:r>
+      <w:proofErr w:type="gramStart"/>
+      <w:r>
+        <w:t>server, and</w:t>
+      </w:r>
+      <w:proofErr w:type="gramEnd"/>
+      <w:r>
+        <w:t xml:space="preserve"> will end the game.</w:t>
+      </w:r>
+    </w:p>
+    <w:p>
+      <w:pPr>
+        <w:pStyle w:val="ListParagraph"/>
+        <w:numPr>
+          <w:ilvl w:val="0"/>
+          <w:numId w:val="1"/>
+        </w:numPr>
+      </w:pPr>
+      <w:r>
+        <w:t xml:space="preserve">At the end of each </w:t>
+      </w:r>
+      <w:r>
+        <w:t>iteration</w:t>
+      </w:r>
+      <w:r>
+        <w:t xml:space="preserve">, the server will send </w:t>
+      </w:r>
+      <w:r>
+        <w:t>a packet to</w:t>
+      </w:r>
+      <w:r>
+        <w:t xml:space="preserve"> both clients containing the game state (as seen above).</w:t>
       </w:r>
     </w:p>
     <w:p>
@@ -163,84 +706,89 @@
         <w:pStyle w:val="Heading1"/>
       </w:pPr>
       <w:r>
+        <w:lastRenderedPageBreak/>
         <w:t>User Manual</w:t>
       </w:r>
     </w:p>
     <w:p>
-      <w:r>
-        <w:t xml:space="preserve">First the user needs to start </w:t>
-      </w:r>
-      <w:r>
-        <w:t>the</w:t>
-      </w:r>
-      <w:r>
-        <w:t xml:space="preserve"> server so that the clients can login</w:t>
-      </w:r>
-      <w:r>
-        <w:t xml:space="preserve">, </w:t>
-      </w:r>
-      <w:r>
-        <w:t>then</w:t>
-      </w:r>
-      <w:r>
-        <w:t xml:space="preserve"> the 2 players start a</w:t>
-      </w:r>
-      <w:r>
-        <w:t xml:space="preserve"> client</w:t>
+      <w:pPr>
+        <w:pStyle w:val="Heading2"/>
+      </w:pPr>
+      <w:r>
+        <w:t>Files</w:t>
+      </w:r>
+    </w:p>
+    <w:p>
+      <w:r>
+        <w:t>The user needs to run the “pong_client.py” file to start a client, and the “pong_server.py” file to start a server.</w:t>
+      </w:r>
+    </w:p>
+    <w:p>
+      <w:pPr>
+        <w:pStyle w:val="Heading2"/>
+      </w:pPr>
+      <w:r>
+        <w:t>Client Setup</w:t>
+      </w:r>
+    </w:p>
+    <w:p>
+      <w:r>
+        <w:t>Upon starting a client, the user must enter a valid server address. If successfully connected, the game should start once a second client connects.</w:t>
+      </w:r>
+    </w:p>
+    <w:p>
+      <w:r>
+        <w:t>In the game, the client uses “W” to move its paddle up and “S” to move it down.</w:t>
+      </w:r>
+    </w:p>
+    <w:p>
+      <w:r>
+        <w:t>If “Q” is pressed, the client disconnects from the server and awaits a new server address.</w:t>
+      </w:r>
+    </w:p>
+    <w:p>
+      <w:r>
+        <w:t>If “CTRL+Q” is pressed, the client quits the game entirely.</w:t>
+      </w:r>
+    </w:p>
+    <w:p>
+      <w:pPr>
+        <w:pStyle w:val="Heading2"/>
+      </w:pPr>
+      <w:r>
+        <w:t>Server Setup</w:t>
+      </w:r>
+    </w:p>
+    <w:p>
+      <w:r>
+        <w:t>Upon starting a server, the user must then enter a valid IPV4 address as well as an unused port</w:t>
+      </w:r>
+      <w:r>
+        <w:t xml:space="preserve"> (usually from </w:t>
+      </w:r>
+      <w:r>
+        <w:t>of 49152</w:t>
+      </w:r>
+      <w:r>
+        <w:t xml:space="preserve"> to </w:t>
+      </w:r>
+      <w:r>
+        <w:t>65535</w:t>
+      </w:r>
+      <w:r>
+        <w:t>)</w:t>
       </w:r>
       <w:r>
         <w:t>.</w:t>
       </w:r>
     </w:p>
-    <w:p>
-      <w:r>
-        <w:t>Then write on the server next to the host the Ip4 address of the localhost</w:t>
-      </w:r>
-      <w:r>
-        <w:t>,</w:t>
-      </w:r>
-      <w:r>
-        <w:t xml:space="preserve"> after</w:t>
-      </w:r>
-      <w:r>
-        <w:t xml:space="preserve"> write on the port  a number in range of </w:t>
-      </w:r>
-      <w:r>
-        <w:t>49152–65535</w:t>
-      </w:r>
-      <w:r>
-        <w:t>, this 2 numbers will also be written on the</w:t>
-      </w:r>
-      <w:r>
-        <w:t xml:space="preserve"> 2</w:t>
-      </w:r>
-      <w:r>
-        <w:t xml:space="preserve"> client</w:t>
-      </w:r>
-      <w:r>
-        <w:t>s</w:t>
-      </w:r>
-      <w:r>
-        <w:t xml:space="preserve">, after the 2 clients are in the game starts use w to go up with your paddle and s to go down, try to not let the ball pass </w:t>
-      </w:r>
-      <w:r>
-        <w:t>through</w:t>
-      </w:r>
-      <w:r>
-        <w:t xml:space="preserve"> your paddle</w:t>
-      </w:r>
-      <w:r>
-        <w:t xml:space="preserve"> to your goal, the player can leave the game by clicking control q.</w:t>
-      </w:r>
-    </w:p>
-    <w:p/>
     <w:p/>
     <w:p/>
     <w:p/>
     <w:p/>
     <w:p/>
     <w:sectPr>
-      <w:footerReference w:type="default" r:id="rId7"/>
+      <w:footerReference w:type="default" r:id="rId8"/>
       <w:pgSz w:w="11906" w:h="16838"/>
       <w:pgMar w:top="1417" w:right="1417" w:bottom="1417" w:left="1417" w:header="708" w:footer="708" w:gutter="0"/>
       <w:cols w:space="708"/>
@@ -298,27 +846,15 @@
           <w:p>
             <w:pPr>
               <w:pStyle w:val="Footer"/>
-              <w:rPr>
-                <w:lang w:val="fr-LU"/>
-              </w:rPr>
             </w:pPr>
             <w:r>
-              <w:rPr>
-                <w:lang w:val="fr-LU"/>
-              </w:rPr>
               <w:t>Ana Beatriz Morais Branquinho</w:t>
             </w:r>
             <w:r>
-              <w:rPr>
-                <w:lang w:val="fr-LU"/>
-              </w:rPr>
               <w:tab/>
               <w:t>Leandro da Silva Sousa</w:t>
             </w:r>
             <w:r>
-              <w:rPr>
-                <w:lang w:val="fr-LU"/>
-              </w:rPr>
               <w:tab/>
               <w:t xml:space="preserve">Page </w:t>
             </w:r>
@@ -335,7 +871,6 @@
               <w:rPr>
                 <w:b/>
                 <w:bCs/>
-                <w:lang w:val="fr-LU"/>
               </w:rPr>
               <w:instrText xml:space="preserve"> PAGE </w:instrText>
             </w:r>
@@ -353,7 +888,6 @@
                 <w:b/>
                 <w:bCs/>
                 <w:noProof/>
-                <w:lang w:val="fr-LU"/>
               </w:rPr>
               <w:t>2</w:t>
             </w:r>
@@ -367,9 +901,6 @@
               <w:fldChar w:fldCharType="end"/>
             </w:r>
             <w:r>
-              <w:rPr>
-                <w:lang w:val="fr-LU"/>
-              </w:rPr>
               <w:t xml:space="preserve"> of </w:t>
             </w:r>
             <w:r>
@@ -385,7 +916,6 @@
               <w:rPr>
                 <w:b/>
                 <w:bCs/>
-                <w:lang w:val="fr-LU"/>
               </w:rPr>
               <w:instrText xml:space="preserve"> NUMPAGES  </w:instrText>
             </w:r>
@@ -403,7 +933,6 @@
                 <w:b/>
                 <w:bCs/>
                 <w:noProof/>
-                <w:lang w:val="fr-LU"/>
               </w:rPr>
               <w:t>2</w:t>
             </w:r>
@@ -447,6 +976,126 @@
     </w:p>
   </w:footnote>
 </w:footnotes>
+</file>
+
+<file path=word/numbering.xml><?xml version="1.0" encoding="utf-8"?>
+<w:numbering xmlns:wpc="http://schemas.microsoft.com/office/word/2010/wordprocessingCanvas" xmlns:cx="http://schemas.microsoft.com/office/drawing/2014/chartex" xmlns:cx1="http://schemas.microsoft.com/office/drawing/2015/9/8/chartex" xmlns:cx2="http://schemas.microsoft.com/office/drawing/2015/10/21/chartex" xmlns:cx3="http://schemas.microsoft.com/office/drawing/2016/5/9/chartex" xmlns:cx4="http://schemas.microsoft.com/office/drawing/2016/5/10/chartex" xmlns:cx5="http://schemas.microsoft.com/office/drawing/2016/5/11/chartex" xmlns:cx6="http://schemas.microsoft.com/office/drawing/2016/5/12/chartex" xmlns:cx7="http://schemas.microsoft.com/office/drawing/2016/5/13/chartex" xmlns:cx8="http://schemas.microsoft.com/office/drawing/2016/5/14/chartex" xmlns:mc="http://schemas.openxmlformats.org/markup-compatibility/2006" xmlns:aink="http://schemas.microsoft.com/office/drawing/2016/ink" xmlns:am3d="http://schemas.microsoft.com/office/drawing/2017/model3d" xmlns:o="urn:schemas-microsoft-com:office:office" xmlns:oel="http://schemas.microsoft.com/office/2019/extlst" xmlns:r="http://schemas.openxmlformats.org/officeDocument/2006/relationships" xmlns:m="http://schemas.openxmlformats.org/officeDocument/2006/math" xmlns:v="urn:schemas-microsoft-com:vml" xmlns:wp14="http://schemas.microsoft.com/office/word/2010/wordprocessingDrawing" xmlns:wp="http://schemas.openxmlformats.org/drawingml/2006/wordprocessingDrawing" xmlns:w10="urn:schemas-microsoft-com:office:word" xmlns:w="http://schemas.openxmlformats.org/wordprocessingml/2006/main" xmlns:w14="http://schemas.microsoft.com/office/word/2010/wordml" xmlns:w15="http://schemas.microsoft.com/office/word/2012/wordml" xmlns:w16cex="http://schemas.microsoft.com/office/word/2018/wordml/cex" xmlns:w16cid="http://schemas.microsoft.com/office/word/2016/wordml/cid" xmlns:w16="http://schemas.microsoft.com/office/word/2018/wordml" xmlns:w16du="http://schemas.microsoft.com/office/word/2023/wordml/word16du" xmlns:w16sdtdh="http://schemas.microsoft.com/office/word/2020/wordml/sdtdatahash" xmlns:w16sdtfl="http://schemas.microsoft.com/office/word/2024/wordml/sdtformatlock" xmlns:w16se="http://schemas.microsoft.com/office/word/2015/wordml/symex" xmlns:wpg="http://schemas.microsoft.com/office/word/2010/wordprocessingGroup" xmlns:wpi="http://schemas.microsoft.com/office/word/2010/wordprocessingInk" xmlns:wne="http://schemas.microsoft.com/office/word/2006/wordml" xmlns:wps="http://schemas.microsoft.com/office/word/2010/wordprocessingShape" mc:Ignorable="w14 w15 w16se w16cid w16 w16cex w16sdtdh w16sdtfl w16du wp14">
+  <w:abstractNum w:abstractNumId="0" w15:restartNumberingAfterBreak="0">
+    <w:nsid w:val="5022631A"/>
+    <w:multiLevelType w:val="hybridMultilevel"/>
+    <w:tmpl w:val="BDECA6BE"/>
+    <w:lvl w:ilvl="0" w:tplc="98324774">
+      <w:numFmt w:val="bullet"/>
+      <w:lvlText w:val="-"/>
+      <w:lvlJc w:val="left"/>
+      <w:pPr>
+        <w:ind w:left="720" w:hanging="360"/>
+      </w:pPr>
+      <w:rPr>
+        <w:rFonts w:ascii="Gill Sans MT" w:eastAsiaTheme="minorEastAsia" w:hAnsi="Gill Sans MT" w:cstheme="minorBidi" w:hint="default"/>
+      </w:rPr>
+    </w:lvl>
+    <w:lvl w:ilvl="1" w:tplc="040C0003">
+      <w:start w:val="1"/>
+      <w:numFmt w:val="bullet"/>
+      <w:lvlText w:val="o"/>
+      <w:lvlJc w:val="left"/>
+      <w:pPr>
+        <w:ind w:left="1440" w:hanging="360"/>
+      </w:pPr>
+      <w:rPr>
+        <w:rFonts w:ascii="Courier New" w:hAnsi="Courier New" w:cs="Courier New" w:hint="default"/>
+      </w:rPr>
+    </w:lvl>
+    <w:lvl w:ilvl="2" w:tplc="040C0005">
+      <w:start w:val="1"/>
+      <w:numFmt w:val="bullet"/>
+      <w:lvlText w:val=""/>
+      <w:lvlJc w:val="left"/>
+      <w:pPr>
+        <w:ind w:left="2160" w:hanging="360"/>
+      </w:pPr>
+      <w:rPr>
+        <w:rFonts w:ascii="Wingdings" w:hAnsi="Wingdings" w:hint="default"/>
+      </w:rPr>
+    </w:lvl>
+    <w:lvl w:ilvl="3" w:tplc="040C0001" w:tentative="1">
+      <w:start w:val="1"/>
+      <w:numFmt w:val="bullet"/>
+      <w:lvlText w:val=""/>
+      <w:lvlJc w:val="left"/>
+      <w:pPr>
+        <w:ind w:left="2880" w:hanging="360"/>
+      </w:pPr>
+      <w:rPr>
+        <w:rFonts w:ascii="Symbol" w:hAnsi="Symbol" w:hint="default"/>
+      </w:rPr>
+    </w:lvl>
+    <w:lvl w:ilvl="4" w:tplc="040C0003" w:tentative="1">
+      <w:start w:val="1"/>
+      <w:numFmt w:val="bullet"/>
+      <w:lvlText w:val="o"/>
+      <w:lvlJc w:val="left"/>
+      <w:pPr>
+        <w:ind w:left="3600" w:hanging="360"/>
+      </w:pPr>
+      <w:rPr>
+        <w:rFonts w:ascii="Courier New" w:hAnsi="Courier New" w:cs="Courier New" w:hint="default"/>
+      </w:rPr>
+    </w:lvl>
+    <w:lvl w:ilvl="5" w:tplc="040C0005" w:tentative="1">
+      <w:start w:val="1"/>
+      <w:numFmt w:val="bullet"/>
+      <w:lvlText w:val=""/>
+      <w:lvlJc w:val="left"/>
+      <w:pPr>
+        <w:ind w:left="4320" w:hanging="360"/>
+      </w:pPr>
+      <w:rPr>
+        <w:rFonts w:ascii="Wingdings" w:hAnsi="Wingdings" w:hint="default"/>
+      </w:rPr>
+    </w:lvl>
+    <w:lvl w:ilvl="6" w:tplc="040C0001" w:tentative="1">
+      <w:start w:val="1"/>
+      <w:numFmt w:val="bullet"/>
+      <w:lvlText w:val=""/>
+      <w:lvlJc w:val="left"/>
+      <w:pPr>
+        <w:ind w:left="5040" w:hanging="360"/>
+      </w:pPr>
+      <w:rPr>
+        <w:rFonts w:ascii="Symbol" w:hAnsi="Symbol" w:hint="default"/>
+      </w:rPr>
+    </w:lvl>
+    <w:lvl w:ilvl="7" w:tplc="040C0003" w:tentative="1">
+      <w:start w:val="1"/>
+      <w:numFmt w:val="bullet"/>
+      <w:lvlText w:val="o"/>
+      <w:lvlJc w:val="left"/>
+      <w:pPr>
+        <w:ind w:left="5760" w:hanging="360"/>
+      </w:pPr>
+      <w:rPr>
+        <w:rFonts w:ascii="Courier New" w:hAnsi="Courier New" w:cs="Courier New" w:hint="default"/>
+      </w:rPr>
+    </w:lvl>
+    <w:lvl w:ilvl="8" w:tplc="040C0005" w:tentative="1">
+      <w:start w:val="1"/>
+      <w:numFmt w:val="bullet"/>
+      <w:lvlText w:val=""/>
+      <w:lvlJc w:val="left"/>
+      <w:pPr>
+        <w:ind w:left="6480" w:hanging="360"/>
+      </w:pPr>
+      <w:rPr>
+        <w:rFonts w:ascii="Wingdings" w:hAnsi="Wingdings" w:hint="default"/>
+      </w:rPr>
+    </w:lvl>
+  </w:abstractNum>
+  <w:num w:numId="1" w16cid:durableId="2101824952">
+    <w:abstractNumId w:val="0"/>
+  </w:num>
+</w:numbering>
 </file>
 
 <file path=word/styles.xml><?xml version="1.0" encoding="utf-8"?>
@@ -879,7 +1528,6 @@
     <w:next w:val="Normal"/>
     <w:link w:val="Heading2Char"/>
     <w:uiPriority w:val="9"/>
-    <w:semiHidden/>
     <w:unhideWhenUsed/>
     <w:qFormat/>
     <w:rsid w:val="00B136FF"/>
@@ -1062,7 +1710,6 @@
   <w:style w:type="character" w:default="1" w:styleId="DefaultParagraphFont">
     <w:name w:val="Default Paragraph Font"/>
     <w:uiPriority w:val="1"/>
-    <w:semiHidden/>
     <w:unhideWhenUsed/>
   </w:style>
   <w:style w:type="table" w:default="1" w:styleId="TableNormal">
@@ -1104,7 +1751,6 @@
     <w:basedOn w:val="DefaultParagraphFont"/>
     <w:link w:val="Heading2"/>
     <w:uiPriority w:val="9"/>
-    <w:semiHidden/>
     <w:rsid w:val="00B136FF"/>
     <w:rPr>
       <w:rFonts w:asciiTheme="majorHAnsi" w:eastAsiaTheme="majorEastAsia" w:hAnsiTheme="majorHAnsi" w:cstheme="majorBidi"/>

</xml_diff>

<commit_message>
--- FINAL COMMIT ---
</commit_message>
<xml_diff>
--- a/DOC/Networks 2 - TP01 Report.docx
+++ b/DOC/Networks 2 - TP01 Report.docx
@@ -76,6 +76,19 @@
         <w:pStyle w:val="Heading1"/>
       </w:pPr>
       <w:r>
+        <w:t>Requirements</w:t>
+      </w:r>
+    </w:p>
+    <w:p>
+      <w:r>
+        <w:t>The game requires “pygame-ce” (preferably the most recent version to avoid any problems) and the “socket” library included in python.</w:t>
+      </w:r>
+    </w:p>
+    <w:p>
+      <w:pPr>
+        <w:pStyle w:val="Heading1"/>
+      </w:pPr>
+      <w:r>
         <w:t>Code Architecture</w:t>
       </w:r>
     </w:p>
@@ -225,6 +238,7 @@
         </w:numPr>
       </w:pPr>
       <w:r>
+        <w:lastRenderedPageBreak/>
         <w:t>If the client successfully connects to the server, they will receive an ID back from the server, which will be the player</w:t>
       </w:r>
       <w:r>
@@ -273,7 +287,6 @@
         </w:numPr>
       </w:pPr>
       <w:r>
-        <w:lastRenderedPageBreak/>
         <w:t>A quit packet. This packet means that the other player has left, so the client will end the game view and print the final score on the console.</w:t>
       </w:r>
       <w:r>
@@ -634,6 +647,7 @@
         </w:numPr>
       </w:pPr>
       <w:r>
+        <w:lastRenderedPageBreak/>
         <w:t xml:space="preserve">If the </w:t>
       </w:r>
       <w:r>
@@ -690,7 +704,6 @@
         <w:pStyle w:val="Heading1"/>
       </w:pPr>
       <w:r>
-        <w:lastRenderedPageBreak/>
         <w:t>User Manual</w:t>
       </w:r>
     </w:p>

</xml_diff>